<commit_message>
Reviewed Signed-off-by: STUDENT Robert Smyth <t00145976@365s.ittralee.ie>
</commit_message>
<xml_diff>
--- a/SWDV 61020 Practical Gaming Document.docx
+++ b/SWDV 61020 Practical Gaming Document.docx
@@ -1,6 +1,6 @@
 
 <file path=word/document.xml><?xml version="1.0" encoding="utf-8"?>
-<w:document xmlns:wpc="http://schemas.microsoft.com/office/word/2010/wordprocessingCanvas" xmlns:cx="http://schemas.microsoft.com/office/drawing/2014/chartex" xmlns:cx1="http://schemas.microsoft.com/office/drawing/2015/9/8/chartex" xmlns:cx2="http://schemas.microsoft.com/office/drawing/2015/10/21/chartex" xmlns:cx3="http://schemas.microsoft.com/office/drawing/2016/5/9/chartex" xmlns:cx4="http://schemas.microsoft.com/office/drawing/2016/5/10/chartex" xmlns:cx5="http://schemas.microsoft.com/office/drawing/2016/5/11/chartex" xmlns:cx6="http://schemas.microsoft.com/office/drawing/2016/5/12/chartex" xmlns:cx7="http://schemas.microsoft.com/office/drawing/2016/5/13/chartex" xmlns:cx8="http://schemas.microsoft.com/office/drawing/2016/5/14/chartex" xmlns:mc="http://schemas.openxmlformats.org/markup-compatibility/2006" xmlns:aink="http://schemas.microsoft.com/office/drawing/2016/ink" xmlns:am3d="http://schemas.microsoft.com/office/drawing/2017/model3d" xmlns:o="urn:schemas-microsoft-com:office:office" xmlns:oel="http://schemas.microsoft.com/office/2019/extlst" xmlns:r="http://schemas.openxmlformats.org/officeDocument/2006/relationships" xmlns:m="http://schemas.openxmlformats.org/officeDocument/2006/math" xmlns:v="urn:schemas-microsoft-com:vml" xmlns:wp14="http://schemas.microsoft.com/office/word/2010/wordprocessingDrawing" xmlns:wp="http://schemas.openxmlformats.org/drawingml/2006/wordprocessingDrawing" xmlns:w10="urn:schemas-microsoft-com:office:word" xmlns:w="http://schemas.openxmlformats.org/wordprocessingml/2006/main" xmlns:w14="http://schemas.microsoft.com/office/word/2010/wordml" xmlns:w15="http://schemas.microsoft.com/office/word/2012/wordml" xmlns:w16cex="http://schemas.microsoft.com/office/word/2018/wordml/cex" xmlns:w16cid="http://schemas.microsoft.com/office/word/2016/wordml/cid" xmlns:w16="http://schemas.microsoft.com/office/word/2018/wordml" xmlns:w16du="http://schemas.microsoft.com/office/word/2023/wordml/word16du" xmlns:w16sdtdh="http://schemas.microsoft.com/office/word/2020/wordml/sdtdatahash" xmlns:w16sdtfl="http://schemas.microsoft.com/office/word/2024/wordml/sdtformatlock" xmlns:w16se="http://schemas.microsoft.com/office/word/2015/wordml/symex" xmlns:wpg="http://schemas.microsoft.com/office/word/2010/wordprocessingGroup" xmlns:wpi="http://schemas.microsoft.com/office/word/2010/wordprocessingInk" xmlns:wne="http://schemas.microsoft.com/office/word/2006/wordml" xmlns:wps="http://schemas.microsoft.com/office/word/2010/wordprocessingShape" mc:Ignorable="w14 w15 w16se w16cid w16 w16cex w16sdtdh w16sdtfl w16du wp14">
+<w:document xmlns:wpc="http://schemas.microsoft.com/office/word/2010/wordprocessingCanvas" xmlns:cx="http://schemas.microsoft.com/office/drawing/2014/chartex" xmlns:cx1="http://schemas.microsoft.com/office/drawing/2015/9/8/chartex" xmlns:cx2="http://schemas.microsoft.com/office/drawing/2015/10/21/chartex" xmlns:cx3="http://schemas.microsoft.com/office/drawing/2016/5/9/chartex" xmlns:cx4="http://schemas.microsoft.com/office/drawing/2016/5/10/chartex" xmlns:cx5="http://schemas.microsoft.com/office/drawing/2016/5/11/chartex" xmlns:cx6="http://schemas.microsoft.com/office/drawing/2016/5/12/chartex" xmlns:cx7="http://schemas.microsoft.com/office/drawing/2016/5/13/chartex" xmlns:cx8="http://schemas.microsoft.com/office/drawing/2016/5/14/chartex" xmlns:mc="http://schemas.openxmlformats.org/markup-compatibility/2006" xmlns:aink="http://schemas.microsoft.com/office/drawing/2016/ink" xmlns:am3d="http://schemas.microsoft.com/office/drawing/2017/model3d" xmlns:o="urn:schemas-microsoft-com:office:office" xmlns:r="http://schemas.openxmlformats.org/officeDocument/2006/relationships" xmlns:m="http://schemas.openxmlformats.org/officeDocument/2006/math" xmlns:v="urn:schemas-microsoft-com:vml" xmlns:wp14="http://schemas.microsoft.com/office/word/2010/wordprocessingDrawing" xmlns:wp="http://schemas.openxmlformats.org/drawingml/2006/wordprocessingDrawing" xmlns:w10="urn:schemas-microsoft-com:office:word" xmlns:w="http://schemas.openxmlformats.org/wordprocessingml/2006/main" xmlns:w14="http://schemas.microsoft.com/office/word/2010/wordml" xmlns:w15="http://schemas.microsoft.com/office/word/2012/wordml" xmlns:w16cex="http://schemas.microsoft.com/office/word/2018/wordml/cex" xmlns:w16cid="http://schemas.microsoft.com/office/word/2016/wordml/cid" xmlns:w16="http://schemas.microsoft.com/office/word/2018/wordml" xmlns:w16sdtdh="http://schemas.microsoft.com/office/word/2020/wordml/sdtdatahash" xmlns:w16se="http://schemas.microsoft.com/office/word/2015/wordml/symex" xmlns:wpg="http://schemas.microsoft.com/office/word/2010/wordprocessingGroup" xmlns:wpi="http://schemas.microsoft.com/office/word/2010/wordprocessingInk" xmlns:wne="http://schemas.microsoft.com/office/word/2006/wordml" xmlns:wps="http://schemas.microsoft.com/office/word/2010/wordprocessingShape" mc:Ignorable="w14 w15 w16se w16cid w16 w16cex w16sdtdh wp14">
   <w:body>
     <w:p>
       <w:pPr>
@@ -86,19 +86,15 @@
         <w:br/>
         <w:t xml:space="preserve">There is a health bar visible on screen that keeps track </w:t>
       </w:r>
-      <w:proofErr w:type="spellStart"/>
-      <w:r>
-        <w:t>fo</w:t>
-      </w:r>
-      <w:proofErr w:type="spellEnd"/>
+      <w:r>
+        <w:t>of</w:t>
+      </w:r>
       <w:r>
         <w:t xml:space="preserve"> the players health. There is also an arrow counter beside this health bar which displays the number </w:t>
       </w:r>
-      <w:proofErr w:type="spellStart"/>
-      <w:r>
-        <w:t>fo</w:t>
-      </w:r>
-      <w:proofErr w:type="spellEnd"/>
+      <w:r>
+        <w:t>of</w:t>
+      </w:r>
       <w:r>
         <w:t xml:space="preserve"> arrows the player has in their inventory.</w:t>
       </w:r>
@@ -111,37 +107,13 @@
       </w:r>
       <w:r>
         <w:br/>
-        <w:t xml:space="preserve">The goal is to move towards the boss at the end of the level, who chases and attacks the player if within a certain range. If the player is hit by the boss, damage is </w:t>
-      </w:r>
-      <w:proofErr w:type="gramStart"/>
-      <w:r>
-        <w:t>taken</w:t>
-      </w:r>
-      <w:proofErr w:type="gramEnd"/>
-      <w:r>
-        <w:t xml:space="preserve"> and the health bar depletes. If the health bar reaches 0, the player </w:t>
-      </w:r>
-      <w:proofErr w:type="gramStart"/>
-      <w:r>
-        <w:t>dies</w:t>
-      </w:r>
-      <w:proofErr w:type="gramEnd"/>
-      <w:r>
-        <w:t xml:space="preserve"> and a death scene is loaded with the option to try again.</w:t>
+        <w:t>The goal is to move towards the boss at the end of the level, who chases and attacks the player if within a certain range. If the player is hit by the boss, damage is taken and the health bar depletes. If the health bar reaches 0, the player dies and a death scene is loaded with the option to try again.</w:t>
       </w:r>
     </w:p>
     <w:p>
       <w:r>
         <w:br/>
-        <w:t xml:space="preserve">If the player shoots the boss with enough arrows, it will trigger different attack phases, each causing more damage than the other. </w:t>
-      </w:r>
-      <w:proofErr w:type="gramStart"/>
-      <w:r>
-        <w:t>If and when</w:t>
-      </w:r>
-      <w:proofErr w:type="gramEnd"/>
-      <w:r>
-        <w:t xml:space="preserve"> the player kills the boss, a portal is activated behind the boss and when entered by the player, ends the game.</w:t>
+        <w:t>If the player shoots the boss with enough arrows, it will trigger different attack phases, each causing more damage than the other. If and when the player kills the boss, a portal is activated behind the boss and when entered by the player, ends the game.</w:t>
       </w:r>
     </w:p>
     <w:p/>
@@ -250,15 +222,7 @@
         <w:t xml:space="preserve"> </w:t>
       </w:r>
       <w:r>
-        <w:t xml:space="preserve">It can </w:t>
-      </w:r>
-      <w:proofErr w:type="gramStart"/>
-      <w:r>
-        <w:t>be seen being used in</w:t>
-      </w:r>
-      <w:proofErr w:type="gramEnd"/>
-      <w:r>
-        <w:t xml:space="preserve"> the characters movement script, </w:t>
+        <w:t xml:space="preserve">It can be seen being used in the characters movement script, </w:t>
       </w:r>
       <w:proofErr w:type="spellStart"/>
       <w:r>
@@ -297,6 +261,9 @@
         <w:ind w:left="1080"/>
       </w:pPr>
       <w:r>
+        <w:rPr>
+          <w:noProof/>
+        </w:rPr>
         <w:drawing>
           <wp:inline distT="0" distB="0" distL="0" distR="0" wp14:anchorId="2E839314" wp14:editId="08AE2103">
             <wp:extent cx="5420481" cy="1762371"/>
@@ -381,15 +348,7 @@
       </w:r>
       <w:proofErr w:type="spellEnd"/>
       <w:r>
-        <w:t>, this is used to ensure both the character(player</w:t>
-      </w:r>
-      <w:proofErr w:type="gramStart"/>
-      <w:r>
-        <w:t>)</w:t>
-      </w:r>
-      <w:proofErr w:type="gramEnd"/>
-      <w:r>
-        <w:t xml:space="preserve"> and the boss implement the </w:t>
+        <w:t xml:space="preserve">, this is used to ensure both the character(player) and the boss implement the </w:t>
       </w:r>
       <w:proofErr w:type="spellStart"/>
       <w:proofErr w:type="gramStart"/>
@@ -426,6 +385,9 @@
         <w:ind w:left="1440"/>
       </w:pPr>
       <w:r>
+        <w:rPr>
+          <w:noProof/>
+        </w:rPr>
         <w:drawing>
           <wp:inline distT="0" distB="0" distL="0" distR="0" wp14:anchorId="22466446" wp14:editId="01818BE1">
             <wp:extent cx="4648849" cy="733527"/>
@@ -531,15 +493,7 @@
         <w:t xml:space="preserve"> </w:t>
       </w:r>
       <w:r>
-        <w:t xml:space="preserve">I could have used it to allow the health of the player and the boss to be the same logic </w:t>
-      </w:r>
-      <w:proofErr w:type="gramStart"/>
-      <w:r>
-        <w:t>in regards to</w:t>
-      </w:r>
-      <w:proofErr w:type="gramEnd"/>
-      <w:r>
-        <w:t xml:space="preserve"> depletion or regeneration.</w:t>
+        <w:t>I could have used it to allow the health of the player and the boss to be the same logic in regards to depletion or regeneration.</w:t>
       </w:r>
       <w:r>
         <w:t xml:space="preserve"> </w:t>
@@ -551,6 +505,9 @@
         <w:ind w:left="1440"/>
       </w:pPr>
       <w:r>
+        <w:rPr>
+          <w:noProof/>
+        </w:rPr>
         <w:drawing>
           <wp:inline distT="0" distB="0" distL="0" distR="0" wp14:anchorId="46391742" wp14:editId="173E1F56">
             <wp:extent cx="4648849" cy="733527"/>
@@ -672,6 +629,9 @@
         <w:br/>
       </w:r>
       <w:r>
+        <w:rPr>
+          <w:noProof/>
+        </w:rPr>
         <w:drawing>
           <wp:inline distT="0" distB="0" distL="0" distR="0" wp14:anchorId="76652078" wp14:editId="209B9C2C">
             <wp:extent cx="4763165" cy="2495898"/>
@@ -716,6 +676,9 @@
         <w:br/>
       </w:r>
       <w:r>
+        <w:rPr>
+          <w:noProof/>
+        </w:rPr>
         <w:drawing>
           <wp:inline distT="0" distB="0" distL="0" distR="0" wp14:anchorId="36BFB897" wp14:editId="741956AA">
             <wp:extent cx="5515745" cy="3743847"/>
@@ -856,13 +819,8 @@
       <w:proofErr w:type="spellEnd"/>
       <w:proofErr w:type="gramEnd"/>
       <w:r>
-        <w:t>(</w:t>
-      </w:r>
-      <w:proofErr w:type="gramStart"/>
-      <w:r>
-        <w:t>);</w:t>
-      </w:r>
-      <w:proofErr w:type="gramEnd"/>
+        <w:t>();</w:t>
+      </w:r>
       <w:r>
         <w:t xml:space="preserve"> </w:t>
       </w:r>
@@ -873,6 +831,9 @@
         <w:ind w:left="1440"/>
       </w:pPr>
       <w:r>
+        <w:rPr>
+          <w:noProof/>
+        </w:rPr>
         <w:drawing>
           <wp:inline distT="0" distB="0" distL="0" distR="0" wp14:anchorId="0FCC738F" wp14:editId="3179FE01">
             <wp:extent cx="5058481" cy="1467055"/>
@@ -997,6 +958,9 @@
         <w:ind w:left="1440"/>
       </w:pPr>
       <w:r>
+        <w:rPr>
+          <w:noProof/>
+        </w:rPr>
         <w:drawing>
           <wp:inline distT="0" distB="0" distL="0" distR="0" wp14:anchorId="40110739" wp14:editId="684EEF8B">
             <wp:extent cx="3553321" cy="1562318"/>
@@ -1046,6 +1010,9 @@
         <w:ind w:left="1440"/>
       </w:pPr>
       <w:r>
+        <w:rPr>
+          <w:noProof/>
+        </w:rPr>
         <w:drawing>
           <wp:inline distT="0" distB="0" distL="0" distR="0" wp14:anchorId="21A9A978" wp14:editId="04D733EB">
             <wp:extent cx="4172532" cy="438211"/>
@@ -1095,6 +1062,9 @@
         <w:ind w:left="1440"/>
       </w:pPr>
       <w:r>
+        <w:rPr>
+          <w:noProof/>
+        </w:rPr>
         <w:drawing>
           <wp:inline distT="0" distB="0" distL="0" distR="0" wp14:anchorId="6D810364" wp14:editId="096C02C0">
             <wp:extent cx="4344006" cy="333422"/>
@@ -1319,6 +1289,9 @@
         <w:ind w:left="1080"/>
       </w:pPr>
       <w:r>
+        <w:rPr>
+          <w:noProof/>
+        </w:rPr>
         <w:drawing>
           <wp:inline distT="0" distB="0" distL="0" distR="0" wp14:anchorId="0CA751FC" wp14:editId="48E7FFD4">
             <wp:extent cx="4200525" cy="1241064"/>
@@ -1400,6 +1373,9 @@
     </w:p>
     <w:p>
       <w:r>
+        <w:rPr>
+          <w:noProof/>
+        </w:rPr>
         <w:drawing>
           <wp:inline distT="0" distB="0" distL="0" distR="0" wp14:anchorId="0D1023FA" wp14:editId="56627027">
             <wp:extent cx="5731510" cy="480695"/>
@@ -1461,44 +1437,30 @@
         <w:t xml:space="preserve"> </w:t>
       </w:r>
       <w:r>
-        <w:t>These are values already coded in the scripts.</w:t>
-      </w:r>
-    </w:p>
-    <w:p>
-      <w:pPr>
-        <w:pStyle w:val="ListParagraph"/>
-        <w:numPr>
-          <w:ilvl w:val="1"/>
-          <w:numId w:val="1"/>
-        </w:numPr>
-      </w:pPr>
-      <w:r>
-        <w:t xml:space="preserve"> </w:t>
-      </w:r>
-      <w:r>
-        <w:t xml:space="preserve">For </w:t>
-      </w:r>
-      <w:proofErr w:type="gramStart"/>
-      <w:r>
-        <w:t>example</w:t>
-      </w:r>
-      <w:proofErr w:type="gramEnd"/>
-      <w:r>
-        <w:t xml:space="preserve"> where I change gameplay by suggestion if a </w:t>
-      </w:r>
-      <w:proofErr w:type="gramStart"/>
-      <w:r>
-        <w:t>players</w:t>
-      </w:r>
-      <w:proofErr w:type="gramEnd"/>
-      <w:r>
-        <w:t xml:space="preserve"> health is below 50 to do an action.</w:t>
-      </w:r>
-      <w:r>
-        <w:t xml:space="preserve"> </w:t>
-      </w:r>
-      <w:r>
-        <w:t>if (</w:t>
+        <w:t>These are</w:t>
+      </w:r>
+      <w:r>
+        <w:t xml:space="preserve"> bad</w:t>
+      </w:r>
+      <w:r>
+        <w:t xml:space="preserve"> values </w:t>
+      </w:r>
+      <w:r>
+        <w:t>in the scripts</w:t>
+      </w:r>
+      <w:r>
+        <w:t>.</w:t>
+      </w:r>
+      <w:r>
+        <w:t xml:space="preserve"> For example, where I have </w:t>
+      </w:r>
+    </w:p>
+    <w:p>
+      <w:pPr>
+        <w:ind w:left="1080"/>
+      </w:pPr>
+      <w:r>
+        <w:t xml:space="preserve">if </w:t>
       </w:r>
       <w:proofErr w:type="spellStart"/>
       <w:r>
@@ -1506,21 +1468,15 @@
       </w:r>
       <w:proofErr w:type="spellEnd"/>
       <w:r>
-        <w:t xml:space="preserve"> &lt;= 50)</w:t>
-      </w:r>
-      <w:r>
-        <w:t xml:space="preserve"> Also where I initialise a serialized field to display the health warning if the player reaches a certain health threshold, </w:t>
-      </w:r>
-      <w:r>
-        <w:t>[</w:t>
+        <w:t xml:space="preserve"> &lt;= 50, I should change this to if </w:t>
       </w:r>
       <w:proofErr w:type="spellStart"/>
       <w:r>
-        <w:t>SerializeField</w:t>
+        <w:t>currentHealth</w:t>
       </w:r>
       <w:proofErr w:type="spellEnd"/>
       <w:r>
-        <w:t xml:space="preserve">] private float </w:t>
+        <w:t xml:space="preserve"> &lt;= </w:t>
       </w:r>
       <w:proofErr w:type="spellStart"/>
       <w:r>
@@ -1528,18 +1484,22 @@
       </w:r>
       <w:proofErr w:type="spellEnd"/>
       <w:r>
-        <w:t xml:space="preserve"> = 50</w:t>
-      </w:r>
-      <w:proofErr w:type="gramStart"/>
-      <w:r>
-        <w:t>f;</w:t>
-      </w:r>
-      <w:r>
-        <w:t>.</w:t>
-      </w:r>
-      <w:proofErr w:type="gramEnd"/>
-      <w:r>
-        <w:t xml:space="preserve"> This is important as it make it easier to read the code and maintain the code.</w:t>
+        <w:t>!</w:t>
+      </w:r>
+    </w:p>
+    <w:p>
+      <w:pPr>
+        <w:pStyle w:val="ListParagraph"/>
+        <w:numPr>
+          <w:ilvl w:val="1"/>
+          <w:numId w:val="1"/>
+        </w:numPr>
+      </w:pPr>
+      <w:r>
+        <w:t xml:space="preserve"> </w:t>
+      </w:r>
+      <w:r>
+        <w:t>This is important as it make it easier to read the code and maintain the code.</w:t>
       </w:r>
     </w:p>
     <w:p>
@@ -1550,6 +1510,9 @@
         <w:t xml:space="preserve"> </w:t>
       </w:r>
       <w:r>
+        <w:rPr>
+          <w:noProof/>
+        </w:rPr>
         <w:drawing>
           <wp:inline distT="0" distB="0" distL="0" distR="0" wp14:anchorId="00CB388E" wp14:editId="6F221642">
             <wp:extent cx="2237118" cy="3028950"/>
@@ -1589,6 +1552,11 @@
     </w:p>
     <w:p>
       <w:pPr>
+        <w:ind w:left="1080"/>
+      </w:pPr>
+    </w:p>
+    <w:p>
+      <w:pPr>
         <w:pStyle w:val="ListParagraph"/>
         <w:numPr>
           <w:ilvl w:val="0"/>
@@ -1631,6 +1599,9 @@
         <w:ind w:left="1080"/>
       </w:pPr>
       <w:r>
+        <w:rPr>
+          <w:noProof/>
+        </w:rPr>
         <w:drawing>
           <wp:inline distT="0" distB="0" distL="0" distR="0" wp14:anchorId="472B695F" wp14:editId="677647DD">
             <wp:extent cx="3629532" cy="1409897"/>
@@ -1776,7 +1747,13 @@
       </w:r>
       <w:proofErr w:type="spellEnd"/>
       <w:r>
-        <w:t xml:space="preserve"> affects the inventory scripts and the boss tracking the player is don’t by the </w:t>
+        <w:t xml:space="preserve"> affects the inventory scripts and the boss tracking the player is don</w:t>
+      </w:r>
+      <w:r>
+        <w:t>e</w:t>
+      </w:r>
+      <w:r>
+        <w:t xml:space="preserve"> by the </w:t>
       </w:r>
       <w:proofErr w:type="spellStart"/>
       <w:r>
@@ -1815,6 +1792,9 @@
         <w:ind w:left="1080"/>
       </w:pPr>
       <w:r>
+        <w:rPr>
+          <w:noProof/>
+        </w:rPr>
         <w:drawing>
           <wp:inline distT="0" distB="0" distL="0" distR="0" wp14:anchorId="26A7C1C6" wp14:editId="6B2063DC">
             <wp:extent cx="5731510" cy="3082290"/>
@@ -1905,7 +1885,53 @@
       </w:r>
       <w:proofErr w:type="gramEnd"/>
       <w:r>
-        <w:t xml:space="preserve">), </w:t>
+        <w:t xml:space="preserve">), Update() and </w:t>
+      </w:r>
+      <w:proofErr w:type="spellStart"/>
+      <w:r>
+        <w:t>OnTriggerEnter</w:t>
+      </w:r>
+      <w:proofErr w:type="spellEnd"/>
+      <w:r>
+        <w:t>()</w:t>
+      </w:r>
+    </w:p>
+    <w:p>
+      <w:pPr>
+        <w:pStyle w:val="ListParagraph"/>
+        <w:numPr>
+          <w:ilvl w:val="1"/>
+          <w:numId w:val="1"/>
+        </w:numPr>
+      </w:pPr>
+      <w:r>
+        <w:t xml:space="preserve"> </w:t>
+      </w:r>
+      <w:r>
+        <w:t xml:space="preserve">The </w:t>
+      </w:r>
+      <w:proofErr w:type="spellStart"/>
+      <w:r>
+        <w:t>OnTriggerEnter</w:t>
+      </w:r>
+      <w:proofErr w:type="spellEnd"/>
+      <w:r>
+        <w:t xml:space="preserve"> is used for picking up the arrows from the chests the be added to the inventory.</w:t>
+      </w:r>
+    </w:p>
+    <w:p>
+      <w:pPr>
+        <w:pStyle w:val="ListParagraph"/>
+        <w:numPr>
+          <w:ilvl w:val="1"/>
+          <w:numId w:val="1"/>
+        </w:numPr>
+      </w:pPr>
+      <w:r>
+        <w:t xml:space="preserve"> </w:t>
+      </w:r>
+      <w:r>
+        <w:t xml:space="preserve">The </w:t>
       </w:r>
       <w:proofErr w:type="gramStart"/>
       <w:r>
@@ -1913,70 +1939,14 @@
       </w:r>
       <w:proofErr w:type="gramEnd"/>
       <w:r>
-        <w:t xml:space="preserve">) and </w:t>
-      </w:r>
-      <w:proofErr w:type="spellStart"/>
-      <w:proofErr w:type="gramStart"/>
-      <w:r>
-        <w:t>OnTriggerEnter</w:t>
-      </w:r>
-      <w:proofErr w:type="spellEnd"/>
-      <w:r>
-        <w:t>(</w:t>
-      </w:r>
-      <w:proofErr w:type="gramEnd"/>
-      <w:r>
-        <w:t>)</w:t>
-      </w:r>
-    </w:p>
-    <w:p>
-      <w:pPr>
-        <w:pStyle w:val="ListParagraph"/>
-        <w:numPr>
-          <w:ilvl w:val="1"/>
-          <w:numId w:val="1"/>
-        </w:numPr>
-      </w:pPr>
-      <w:r>
-        <w:t xml:space="preserve"> </w:t>
-      </w:r>
-      <w:r>
-        <w:t xml:space="preserve">The </w:t>
-      </w:r>
-      <w:proofErr w:type="spellStart"/>
-      <w:r>
-        <w:t>OnTriggerEnter</w:t>
-      </w:r>
-      <w:proofErr w:type="spellEnd"/>
-      <w:r>
-        <w:t xml:space="preserve"> is used for picking up the arrows from the chests the be added to the inventory.</w:t>
-      </w:r>
-    </w:p>
-    <w:p>
-      <w:pPr>
-        <w:pStyle w:val="ListParagraph"/>
-        <w:numPr>
-          <w:ilvl w:val="1"/>
-          <w:numId w:val="1"/>
-        </w:numPr>
-      </w:pPr>
-      <w:r>
-        <w:t xml:space="preserve"> </w:t>
-      </w:r>
-      <w:r>
-        <w:t xml:space="preserve">The </w:t>
-      </w:r>
-      <w:proofErr w:type="gramStart"/>
-      <w:r>
-        <w:t>Update(</w:t>
-      </w:r>
-      <w:proofErr w:type="gramEnd"/>
-      <w:r>
         <w:t>) is for code that needs to run in every frame of the game e.g. checking player input and/or updating the UI.</w:t>
       </w:r>
     </w:p>
     <w:p>
       <w:r>
+        <w:rPr>
+          <w:noProof/>
+        </w:rPr>
         <w:drawing>
           <wp:inline distT="0" distB="0" distL="0" distR="0" wp14:anchorId="212645F0" wp14:editId="5455BAEA">
             <wp:extent cx="5658640" cy="1247949"/>
@@ -2053,15 +2023,7 @@
         <w:t xml:space="preserve"> </w:t>
       </w:r>
       <w:r>
-        <w:t xml:space="preserve">It would be useful to not use the same code in multiple </w:t>
-      </w:r>
-      <w:proofErr w:type="gramStart"/>
-      <w:r>
-        <w:t>places, but</w:t>
-      </w:r>
-      <w:proofErr w:type="gramEnd"/>
-      <w:r>
-        <w:t xml:space="preserve"> instead putting it into a method and calling that method.</w:t>
+        <w:t>It would be useful to not use the same code in multiple places, but instead putting it into a method and calling that method.</w:t>
       </w:r>
     </w:p>
     <w:p>
@@ -2145,6 +2107,9 @@
         <w:t>have different health values that decrease when taking damage</w:t>
       </w:r>
       <w:r>
+        <w:rPr>
+          <w:noProof/>
+        </w:rPr>
         <w:drawing>
           <wp:inline distT="0" distB="0" distL="0" distR="0" wp14:anchorId="56DC5CD5" wp14:editId="5EE249CB">
             <wp:extent cx="4763165" cy="2238687"/>
@@ -2259,6 +2224,9 @@
         <w:ind w:left="1080"/>
       </w:pPr>
       <w:r>
+        <w:rPr>
+          <w:noProof/>
+        </w:rPr>
         <w:drawing>
           <wp:inline distT="0" distB="0" distL="0" distR="0" wp14:anchorId="1144D1C0" wp14:editId="182F6A0D">
             <wp:extent cx="4896533" cy="5582429"/>
@@ -2371,15 +2339,13 @@
         <w:t xml:space="preserve"> </w:t>
       </w:r>
       <w:r>
-        <w:t xml:space="preserve">The main menu leads to the game and the gameplay, which can lead to the death of the character returning them to the main menu, and/or the player kills the boss enabling the end portal which when entered loads the final scene that </w:t>
-      </w:r>
-      <w:proofErr w:type="spellStart"/>
-      <w:r>
-        <w:t>leds</w:t>
-      </w:r>
-      <w:proofErr w:type="spellEnd"/>
-      <w:r>
-        <w:t xml:space="preserve"> the player upon a button click back to the main menu again.</w:t>
+        <w:t>The main menu leads to the game and the gameplay, which can lead to the death of the character returning them to the main menu, and/or the player kills the boss enabling the end portal which when entered loads the final scene that le</w:t>
+      </w:r>
+      <w:r>
+        <w:t>a</w:t>
+      </w:r>
+      <w:r>
+        <w:t>ds the player upon a button click back to the main menu again.</w:t>
       </w:r>
     </w:p>
     <w:p>
@@ -2402,6 +2368,9 @@
         <w:ind w:left="1080"/>
       </w:pPr>
       <w:r>
+        <w:rPr>
+          <w:noProof/>
+        </w:rPr>
         <w:drawing>
           <wp:inline distT="0" distB="0" distL="0" distR="0" wp14:anchorId="642945FE" wp14:editId="1E6F1A83">
             <wp:extent cx="4934639" cy="885949"/>
@@ -2442,6 +2411,9 @@
     <w:p/>
     <w:p>
       <w:r>
+        <w:rPr>
+          <w:noProof/>
+        </w:rPr>
         <w:drawing>
           <wp:inline distT="0" distB="0" distL="0" distR="0" wp14:anchorId="267574D9" wp14:editId="03107F87">
             <wp:extent cx="4848902" cy="2314898"/>
@@ -2490,7 +2462,7 @@
 </file>
 
 <file path=word/numbering.xml><?xml version="1.0" encoding="utf-8"?>
-<w:numbering xmlns:wpc="http://schemas.microsoft.com/office/word/2010/wordprocessingCanvas" xmlns:cx="http://schemas.microsoft.com/office/drawing/2014/chartex" xmlns:cx1="http://schemas.microsoft.com/office/drawing/2015/9/8/chartex" xmlns:cx2="http://schemas.microsoft.com/office/drawing/2015/10/21/chartex" xmlns:cx3="http://schemas.microsoft.com/office/drawing/2016/5/9/chartex" xmlns:cx4="http://schemas.microsoft.com/office/drawing/2016/5/10/chartex" xmlns:cx5="http://schemas.microsoft.com/office/drawing/2016/5/11/chartex" xmlns:cx6="http://schemas.microsoft.com/office/drawing/2016/5/12/chartex" xmlns:cx7="http://schemas.microsoft.com/office/drawing/2016/5/13/chartex" xmlns:cx8="http://schemas.microsoft.com/office/drawing/2016/5/14/chartex" xmlns:mc="http://schemas.openxmlformats.org/markup-compatibility/2006" xmlns:aink="http://schemas.microsoft.com/office/drawing/2016/ink" xmlns:am3d="http://schemas.microsoft.com/office/drawing/2017/model3d" xmlns:o="urn:schemas-microsoft-com:office:office" xmlns:oel="http://schemas.microsoft.com/office/2019/extlst" xmlns:r="http://schemas.openxmlformats.org/officeDocument/2006/relationships" xmlns:m="http://schemas.openxmlformats.org/officeDocument/2006/math" xmlns:v="urn:schemas-microsoft-com:vml" xmlns:wp14="http://schemas.microsoft.com/office/word/2010/wordprocessingDrawing" xmlns:wp="http://schemas.openxmlformats.org/drawingml/2006/wordprocessingDrawing" xmlns:w10="urn:schemas-microsoft-com:office:word" xmlns:w="http://schemas.openxmlformats.org/wordprocessingml/2006/main" xmlns:w14="http://schemas.microsoft.com/office/word/2010/wordml" xmlns:w15="http://schemas.microsoft.com/office/word/2012/wordml" xmlns:w16cex="http://schemas.microsoft.com/office/word/2018/wordml/cex" xmlns:w16cid="http://schemas.microsoft.com/office/word/2016/wordml/cid" xmlns:w16="http://schemas.microsoft.com/office/word/2018/wordml" xmlns:w16du="http://schemas.microsoft.com/office/word/2023/wordml/word16du" xmlns:w16sdtdh="http://schemas.microsoft.com/office/word/2020/wordml/sdtdatahash" xmlns:w16sdtfl="http://schemas.microsoft.com/office/word/2024/wordml/sdtformatlock" xmlns:w16se="http://schemas.microsoft.com/office/word/2015/wordml/symex" xmlns:wpg="http://schemas.microsoft.com/office/word/2010/wordprocessingGroup" xmlns:wpi="http://schemas.microsoft.com/office/word/2010/wordprocessingInk" xmlns:wne="http://schemas.microsoft.com/office/word/2006/wordml" xmlns:wps="http://schemas.microsoft.com/office/word/2010/wordprocessingShape" mc:Ignorable="w14 w15 w16se w16cid w16 w16cex w16sdtdh w16sdtfl w16du wp14">
+<w:numbering xmlns:wpc="http://schemas.microsoft.com/office/word/2010/wordprocessingCanvas" xmlns:cx="http://schemas.microsoft.com/office/drawing/2014/chartex" xmlns:cx1="http://schemas.microsoft.com/office/drawing/2015/9/8/chartex" xmlns:cx2="http://schemas.microsoft.com/office/drawing/2015/10/21/chartex" xmlns:cx3="http://schemas.microsoft.com/office/drawing/2016/5/9/chartex" xmlns:cx4="http://schemas.microsoft.com/office/drawing/2016/5/10/chartex" xmlns:cx5="http://schemas.microsoft.com/office/drawing/2016/5/11/chartex" xmlns:cx6="http://schemas.microsoft.com/office/drawing/2016/5/12/chartex" xmlns:cx7="http://schemas.microsoft.com/office/drawing/2016/5/13/chartex" xmlns:cx8="http://schemas.microsoft.com/office/drawing/2016/5/14/chartex" xmlns:mc="http://schemas.openxmlformats.org/markup-compatibility/2006" xmlns:aink="http://schemas.microsoft.com/office/drawing/2016/ink" xmlns:am3d="http://schemas.microsoft.com/office/drawing/2017/model3d" xmlns:o="urn:schemas-microsoft-com:office:office" xmlns:r="http://schemas.openxmlformats.org/officeDocument/2006/relationships" xmlns:m="http://schemas.openxmlformats.org/officeDocument/2006/math" xmlns:v="urn:schemas-microsoft-com:vml" xmlns:wp14="http://schemas.microsoft.com/office/word/2010/wordprocessingDrawing" xmlns:wp="http://schemas.openxmlformats.org/drawingml/2006/wordprocessingDrawing" xmlns:w10="urn:schemas-microsoft-com:office:word" xmlns:w="http://schemas.openxmlformats.org/wordprocessingml/2006/main" xmlns:w14="http://schemas.microsoft.com/office/word/2010/wordml" xmlns:w15="http://schemas.microsoft.com/office/word/2012/wordml" xmlns:w16cex="http://schemas.microsoft.com/office/word/2018/wordml/cex" xmlns:w16cid="http://schemas.microsoft.com/office/word/2016/wordml/cid" xmlns:w16="http://schemas.microsoft.com/office/word/2018/wordml" xmlns:w16sdtdh="http://schemas.microsoft.com/office/word/2020/wordml/sdtdatahash" xmlns:w16se="http://schemas.microsoft.com/office/word/2015/wordml/symex" xmlns:wpg="http://schemas.microsoft.com/office/word/2010/wordprocessingGroup" xmlns:wpi="http://schemas.microsoft.com/office/word/2010/wordprocessingInk" xmlns:wne="http://schemas.microsoft.com/office/word/2006/wordml" xmlns:wps="http://schemas.microsoft.com/office/word/2010/wordprocessingShape" mc:Ignorable="w14 w15 w16se w16cid w16 w16cex w16sdtdh wp14">
   <w:abstractNum w:abstractNumId="0" w15:restartNumberingAfterBreak="0">
     <w:nsid w:val="1706678D"/>
     <w:multiLevelType w:val="hybridMultilevel"/>
@@ -2604,14 +2576,14 @@
       </w:rPr>
     </w:lvl>
   </w:abstractNum>
-  <w:num w:numId="1" w16cid:durableId="36512878">
+  <w:num w:numId="1">
     <w:abstractNumId w:val="0"/>
   </w:num>
 </w:numbering>
 </file>
 
 <file path=word/styles.xml><?xml version="1.0" encoding="utf-8"?>
-<w:styles xmlns:mc="http://schemas.openxmlformats.org/markup-compatibility/2006" xmlns:r="http://schemas.openxmlformats.org/officeDocument/2006/relationships" xmlns:w="http://schemas.openxmlformats.org/wordprocessingml/2006/main" xmlns:w14="http://schemas.microsoft.com/office/word/2010/wordml" xmlns:w15="http://schemas.microsoft.com/office/word/2012/wordml" xmlns:w16cex="http://schemas.microsoft.com/office/word/2018/wordml/cex" xmlns:w16cid="http://schemas.microsoft.com/office/word/2016/wordml/cid" xmlns:w16="http://schemas.microsoft.com/office/word/2018/wordml" xmlns:w16du="http://schemas.microsoft.com/office/word/2023/wordml/word16du" xmlns:w16sdtdh="http://schemas.microsoft.com/office/word/2020/wordml/sdtdatahash" xmlns:w16sdtfl="http://schemas.microsoft.com/office/word/2024/wordml/sdtformatlock" xmlns:w16se="http://schemas.microsoft.com/office/word/2015/wordml/symex" mc:Ignorable="w14 w15 w16se w16cid w16 w16cex w16sdtdh w16sdtfl w16du">
+<w:styles xmlns:mc="http://schemas.openxmlformats.org/markup-compatibility/2006" xmlns:r="http://schemas.openxmlformats.org/officeDocument/2006/relationships" xmlns:w="http://schemas.openxmlformats.org/wordprocessingml/2006/main" xmlns:w14="http://schemas.microsoft.com/office/word/2010/wordml" xmlns:w15="http://schemas.microsoft.com/office/word/2012/wordml" xmlns:w16cex="http://schemas.microsoft.com/office/word/2018/wordml/cex" xmlns:w16cid="http://schemas.microsoft.com/office/word/2016/wordml/cid" xmlns:w16="http://schemas.microsoft.com/office/word/2018/wordml" xmlns:w16sdtdh="http://schemas.microsoft.com/office/word/2020/wordml/sdtdatahash" xmlns:w16se="http://schemas.microsoft.com/office/word/2015/wordml/symex" mc:Ignorable="w14 w15 w16se w16cid w16 w16cex w16sdtdh">
   <w:docDefaults>
     <w:rPrDefault>
       <w:rPr>

</xml_diff>